<commit_message>
Refactored SpendWise with React Router and separated Expenses page
</commit_message>
<xml_diff>
--- a/project_details.docx
+++ b/project_details.docx
@@ -3284,16 +3284,7 @@
           <w:bCs/>
           <w:color w:val="4472C4" w:themeColor="accent1"/>
         </w:rPr>
-        <w:t xml:space="preserve">14. </w:t>
-      </w:r>
-      <w:r>
-        <w:rPr>
-          <w:rFonts w:ascii="Times New Roman" w:hAnsi="Times New Roman" w:cs="Times New Roman"/>
-          <w:b/>
-          <w:bCs/>
-          <w:color w:val="4472C4" w:themeColor="accent1"/>
-        </w:rPr>
-        <w:t>Update Expense</w:t>
+        <w:t>14. Update Expense</w:t>
       </w:r>
     </w:p>
     <w:p>
@@ -3678,16 +3669,7 @@
           <w:bCs/>
           <w:color w:val="4472C4" w:themeColor="accent1"/>
         </w:rPr>
-        <w:t xml:space="preserve">14. </w:t>
-      </w:r>
-      <w:r>
-        <w:rPr>
-          <w:rFonts w:ascii="Times New Roman" w:hAnsi="Times New Roman" w:cs="Times New Roman"/>
-          <w:b/>
-          <w:bCs/>
-          <w:color w:val="4472C4" w:themeColor="accent1"/>
-        </w:rPr>
-        <w:t>Edit Expense Modal</w:t>
+        <w:t>14. Edit Expense Modal</w:t>
       </w:r>
     </w:p>
     <w:p>
@@ -3882,48 +3864,32 @@
     </w:p>
     <w:p>
       <w:pPr>
-        <w:ind w:left="720"/>
-        <w:rPr>
-          <w:rFonts w:ascii="Times New Roman" w:hAnsi="Times New Roman" w:cs="Times New Roman"/>
-        </w:rPr>
-      </w:pPr>
-    </w:p>
-    <w:p>
-      <w:pPr>
-        <w:ind w:left="720"/>
-        <w:rPr>
-          <w:rFonts w:ascii="Times New Roman" w:hAnsi="Times New Roman" w:cs="Times New Roman"/>
-        </w:rPr>
-      </w:pPr>
-    </w:p>
-    <w:p>
-      <w:pPr>
-        <w:rPr>
-          <w:rFonts w:ascii="Times New Roman" w:hAnsi="Times New Roman" w:cs="Times New Roman"/>
-          <w:b/>
-          <w:bCs/>
-        </w:rPr>
-      </w:pPr>
-      <w:r>
-        <w:rPr>
-          <w:rFonts w:ascii="Times New Roman" w:hAnsi="Times New Roman" w:cs="Times New Roman"/>
-          <w:b/>
-          <w:bCs/>
+        <w:rPr>
+          <w:rFonts w:ascii="Times New Roman" w:hAnsi="Times New Roman" w:cs="Times New Roman"/>
+          <w:b/>
+          <w:bCs/>
+        </w:rPr>
+      </w:pPr>
+      <w:r>
+        <w:rPr>
+          <w:rFonts w:ascii="Times New Roman" w:hAnsi="Times New Roman" w:cs="Times New Roman"/>
+          <w:b/>
+          <w:bCs/>
+        </w:rPr>
+        <w:t>Interview Explanation</w:t>
+      </w:r>
+    </w:p>
+    <w:p>
+      <w:pPr>
+        <w:rPr>
+          <w:rFonts w:ascii="Times New Roman" w:hAnsi="Times New Roman" w:cs="Times New Roman"/>
+        </w:rPr>
+      </w:pPr>
+      <w:r>
+        <w:rPr>
+          <w:rFonts w:ascii="Times New Roman" w:hAnsi="Times New Roman" w:cs="Times New Roman"/>
         </w:rPr>
         <w:lastRenderedPageBreak/>
-        <w:t>Interview Explanation</w:t>
-      </w:r>
-    </w:p>
-    <w:p>
-      <w:pPr>
-        <w:rPr>
-          <w:rFonts w:ascii="Times New Roman" w:hAnsi="Times New Roman" w:cs="Times New Roman"/>
-        </w:rPr>
-      </w:pPr>
-      <w:r>
-        <w:rPr>
-          <w:rFonts w:ascii="Times New Roman" w:hAnsi="Times New Roman" w:cs="Times New Roman"/>
-        </w:rPr>
         <w:t>I used conditional rendering to display a modal when the user selects an expense. The modal pre-fills the existing expense details, allowing users to edit them efficiently while staying on the same page.</w:t>
       </w:r>
     </w:p>
@@ -3943,16 +3909,7 @@
           <w:bCs/>
           <w:color w:val="4472C4" w:themeColor="accent1"/>
         </w:rPr>
-        <w:t xml:space="preserve">16. </w:t>
-      </w:r>
-      <w:r>
-        <w:rPr>
-          <w:rFonts w:ascii="Times New Roman" w:hAnsi="Times New Roman" w:cs="Times New Roman"/>
-          <w:b/>
-          <w:bCs/>
-          <w:color w:val="4472C4" w:themeColor="accent1"/>
-        </w:rPr>
-        <w:t>Complete CRUD Operations</w:t>
+        <w:t>16. Complete CRUD Operations</w:t>
       </w:r>
     </w:p>
     <w:p>
@@ -4127,10 +4084,449 @@
       <w:pPr>
         <w:rPr>
           <w:rFonts w:ascii="Times New Roman" w:hAnsi="Times New Roman" w:cs="Times New Roman"/>
-          <w:b/>
-          <w:bCs/>
-        </w:rPr>
-      </w:pPr>
+        </w:rPr>
+      </w:pPr>
+      <w:r>
+        <w:rPr>
+          <w:rFonts w:ascii="Times New Roman" w:hAnsi="Times New Roman" w:cs="Times New Roman"/>
+        </w:rPr>
+        <w:t>---------------------------------------------------------------------------------------------------------------------------</w:t>
+      </w:r>
+    </w:p>
+    <w:p>
+      <w:pPr>
+        <w:rPr>
+          <w:rFonts w:ascii="Times New Roman" w:hAnsi="Times New Roman" w:cs="Times New Roman"/>
+          <w:b/>
+          <w:bCs/>
+        </w:rPr>
+      </w:pPr>
+      <w:r>
+        <w:rPr>
+          <w:rFonts w:ascii="Times New Roman" w:hAnsi="Times New Roman" w:cs="Times New Roman"/>
+          <w:b/>
+          <w:bCs/>
+        </w:rPr>
+        <w:t>Done with crud operations………..</w:t>
+      </w:r>
+    </w:p>
+    <w:p>
+      <w:pPr>
+        <w:rPr>
+          <w:rFonts w:ascii="Times New Roman" w:hAnsi="Times New Roman" w:cs="Times New Roman"/>
+          <w:b/>
+          <w:bCs/>
+        </w:rPr>
+      </w:pPr>
+      <w:r>
+        <w:rPr>
+          <w:rFonts w:ascii="Times New Roman" w:hAnsi="Times New Roman" w:cs="Times New Roman"/>
+          <w:b/>
+          <w:bCs/>
+        </w:rPr>
+        <w:t xml:space="preserve"> refining the project structure/archtiecture</w:t>
+      </w:r>
+    </w:p>
+    <w:p>
+      <w:pPr>
+        <w:rPr>
+          <w:rFonts w:ascii="Times New Roman" w:hAnsi="Times New Roman" w:cs="Times New Roman"/>
+          <w:b/>
+          <w:bCs/>
+        </w:rPr>
+      </w:pPr>
+      <w:r>
+        <w:rPr>
+          <w:rFonts w:ascii="Times New Roman" w:hAnsi="Times New Roman" w:cs="Times New Roman"/>
+          <w:b/>
+          <w:bCs/>
+        </w:rPr>
+        <w:t>Login</w:t>
+      </w:r>
+    </w:p>
+    <w:p>
+      <w:pPr>
+        <w:rPr>
+          <w:rFonts w:ascii="Times New Roman" w:hAnsi="Times New Roman" w:cs="Times New Roman"/>
+          <w:b/>
+          <w:bCs/>
+        </w:rPr>
+      </w:pPr>
+      <w:r>
+        <w:rPr>
+          <w:rFonts w:ascii="Times New Roman" w:hAnsi="Times New Roman" w:cs="Times New Roman"/>
+          <w:b/>
+          <w:bCs/>
+        </w:rPr>
+        <w:t xml:space="preserve">        ↓</w:t>
+      </w:r>
+    </w:p>
+    <w:p>
+      <w:pPr>
+        <w:rPr>
+          <w:rFonts w:ascii="Times New Roman" w:hAnsi="Times New Roman" w:cs="Times New Roman"/>
+          <w:b/>
+          <w:bCs/>
+        </w:rPr>
+      </w:pPr>
+      <w:r>
+        <w:rPr>
+          <w:rFonts w:ascii="Times New Roman" w:hAnsi="Times New Roman" w:cs="Times New Roman"/>
+          <w:b/>
+          <w:bCs/>
+        </w:rPr>
+        <w:t>Dashboard</w:t>
+      </w:r>
+    </w:p>
+    <w:p>
+      <w:pPr>
+        <w:rPr>
+          <w:rFonts w:ascii="Times New Roman" w:hAnsi="Times New Roman" w:cs="Times New Roman"/>
+          <w:b/>
+          <w:bCs/>
+        </w:rPr>
+      </w:pPr>
+      <w:r>
+        <w:rPr>
+          <w:rFonts w:ascii="Times New Roman" w:hAnsi="Times New Roman" w:cs="Times New Roman"/>
+          <w:b/>
+          <w:bCs/>
+        </w:rPr>
+        <w:t xml:space="preserve">        ↓</w:t>
+      </w:r>
+    </w:p>
+    <w:p>
+      <w:pPr>
+        <w:rPr>
+          <w:rFonts w:ascii="Times New Roman" w:hAnsi="Times New Roman" w:cs="Times New Roman"/>
+          <w:b/>
+          <w:bCs/>
+        </w:rPr>
+      </w:pPr>
+      <w:r>
+        <w:rPr>
+          <w:rFonts w:ascii="Times New Roman" w:hAnsi="Times New Roman" w:cs="Times New Roman"/>
+          <w:b/>
+          <w:bCs/>
+        </w:rPr>
+        <w:t>----------------------------</w:t>
+      </w:r>
+    </w:p>
+    <w:p>
+      <w:pPr>
+        <w:rPr>
+          <w:rFonts w:ascii="Times New Roman" w:hAnsi="Times New Roman" w:cs="Times New Roman"/>
+          <w:b/>
+          <w:bCs/>
+        </w:rPr>
+      </w:pPr>
+      <w:r>
+        <w:rPr>
+          <w:rFonts w:ascii="Times New Roman" w:hAnsi="Times New Roman" w:cs="Times New Roman"/>
+          <w:b/>
+          <w:bCs/>
+        </w:rPr>
+        <w:t xml:space="preserve">| Sidebar                  </w:t>
+      </w:r>
+    </w:p>
+    <w:p>
+      <w:pPr>
+        <w:rPr>
+          <w:rFonts w:ascii="Times New Roman" w:hAnsi="Times New Roman" w:cs="Times New Roman"/>
+          <w:b/>
+          <w:bCs/>
+        </w:rPr>
+      </w:pPr>
+      <w:r>
+        <w:rPr>
+          <w:rFonts w:ascii="Times New Roman" w:hAnsi="Times New Roman" w:cs="Times New Roman"/>
+          <w:b/>
+          <w:bCs/>
+        </w:rPr>
+        <w:t xml:space="preserve">|                          </w:t>
+      </w:r>
+    </w:p>
+    <w:p>
+      <w:pPr>
+        <w:rPr>
+          <w:rFonts w:ascii="Times New Roman" w:hAnsi="Times New Roman" w:cs="Times New Roman"/>
+          <w:b/>
+          <w:bCs/>
+        </w:rPr>
+      </w:pPr>
+      <w:r>
+        <w:rPr>
+          <w:rFonts w:ascii="Times New Roman" w:hAnsi="Times New Roman" w:cs="Times New Roman"/>
+          <w:b/>
+          <w:bCs/>
+        </w:rPr>
+        <w:t xml:space="preserve">| </w:t>
+      </w:r>
+      <w:r>
+        <w:rPr>
+          <w:rFonts w:ascii="Segoe UI Emoji" w:hAnsi="Segoe UI Emoji" w:cs="Segoe UI Emoji"/>
+          <w:b/>
+          <w:bCs/>
+        </w:rPr>
+        <w:t>🏠</w:t>
+      </w:r>
+      <w:r>
+        <w:rPr>
+          <w:rFonts w:ascii="Times New Roman" w:hAnsi="Times New Roman" w:cs="Times New Roman"/>
+          <w:b/>
+          <w:bCs/>
+        </w:rPr>
+        <w:t xml:space="preserve"> Dashboard             </w:t>
+      </w:r>
+    </w:p>
+    <w:p>
+      <w:pPr>
+        <w:rPr>
+          <w:rFonts w:ascii="Times New Roman" w:hAnsi="Times New Roman" w:cs="Times New Roman"/>
+          <w:b/>
+          <w:bCs/>
+        </w:rPr>
+      </w:pPr>
+      <w:r>
+        <w:rPr>
+          <w:rFonts w:ascii="Times New Roman" w:hAnsi="Times New Roman" w:cs="Times New Roman"/>
+          <w:b/>
+          <w:bCs/>
+        </w:rPr>
+        <w:t xml:space="preserve">| </w:t>
+      </w:r>
+      <w:r>
+        <w:rPr>
+          <w:rFonts w:ascii="Segoe UI Emoji" w:hAnsi="Segoe UI Emoji" w:cs="Segoe UI Emoji"/>
+          <w:b/>
+          <w:bCs/>
+        </w:rPr>
+        <w:t>💳</w:t>
+      </w:r>
+      <w:r>
+        <w:rPr>
+          <w:rFonts w:ascii="Times New Roman" w:hAnsi="Times New Roman" w:cs="Times New Roman"/>
+          <w:b/>
+          <w:bCs/>
+        </w:rPr>
+        <w:t xml:space="preserve"> Expenses             </w:t>
+      </w:r>
+    </w:p>
+    <w:p>
+      <w:pPr>
+        <w:rPr>
+          <w:rFonts w:ascii="Times New Roman" w:hAnsi="Times New Roman" w:cs="Times New Roman"/>
+          <w:b/>
+          <w:bCs/>
+        </w:rPr>
+      </w:pPr>
+      <w:r>
+        <w:rPr>
+          <w:rFonts w:ascii="Times New Roman" w:hAnsi="Times New Roman" w:cs="Times New Roman"/>
+          <w:b/>
+          <w:bCs/>
+        </w:rPr>
+        <w:t xml:space="preserve">| </w:t>
+      </w:r>
+      <w:r>
+        <w:rPr>
+          <w:rFonts w:ascii="Segoe UI Emoji" w:hAnsi="Segoe UI Emoji" w:cs="Segoe UI Emoji"/>
+          <w:b/>
+          <w:bCs/>
+        </w:rPr>
+        <w:t>📊</w:t>
+      </w:r>
+      <w:r>
+        <w:rPr>
+          <w:rFonts w:ascii="Times New Roman" w:hAnsi="Times New Roman" w:cs="Times New Roman"/>
+          <w:b/>
+          <w:bCs/>
+        </w:rPr>
+        <w:t xml:space="preserve"> Analytics            </w:t>
+      </w:r>
+    </w:p>
+    <w:p>
+      <w:pPr>
+        <w:rPr>
+          <w:rFonts w:ascii="Times New Roman" w:hAnsi="Times New Roman" w:cs="Times New Roman"/>
+          <w:b/>
+          <w:bCs/>
+        </w:rPr>
+      </w:pPr>
+      <w:r>
+        <w:rPr>
+          <w:rFonts w:ascii="Times New Roman" w:hAnsi="Times New Roman" w:cs="Times New Roman"/>
+          <w:b/>
+          <w:bCs/>
+        </w:rPr>
+        <w:t xml:space="preserve">| </w:t>
+      </w:r>
+      <w:r>
+        <w:rPr>
+          <w:rFonts w:ascii="Segoe UI Emoji" w:hAnsi="Segoe UI Emoji" w:cs="Segoe UI Emoji"/>
+          <w:b/>
+          <w:bCs/>
+        </w:rPr>
+        <w:t>💰</w:t>
+      </w:r>
+      <w:r>
+        <w:rPr>
+          <w:rFonts w:ascii="Times New Roman" w:hAnsi="Times New Roman" w:cs="Times New Roman"/>
+          <w:b/>
+          <w:bCs/>
+        </w:rPr>
+        <w:t xml:space="preserve"> Budget              </w:t>
+      </w:r>
+    </w:p>
+    <w:p>
+      <w:pPr>
+        <w:rPr>
+          <w:rFonts w:ascii="Times New Roman" w:hAnsi="Times New Roman" w:cs="Times New Roman"/>
+          <w:b/>
+          <w:bCs/>
+        </w:rPr>
+      </w:pPr>
+      <w:r>
+        <w:rPr>
+          <w:rFonts w:ascii="Times New Roman" w:hAnsi="Times New Roman" w:cs="Times New Roman"/>
+          <w:b/>
+          <w:bCs/>
+        </w:rPr>
+        <w:t xml:space="preserve">| </w:t>
+      </w:r>
+      <w:r>
+        <w:rPr>
+          <w:rFonts w:ascii="Segoe UI Emoji" w:hAnsi="Segoe UI Emoji" w:cs="Segoe UI Emoji"/>
+          <w:b/>
+          <w:bCs/>
+        </w:rPr>
+        <w:t>🤖</w:t>
+      </w:r>
+      <w:r>
+        <w:rPr>
+          <w:rFonts w:ascii="Times New Roman" w:hAnsi="Times New Roman" w:cs="Times New Roman"/>
+          <w:b/>
+          <w:bCs/>
+        </w:rPr>
+        <w:t xml:space="preserve"> AI Insights          </w:t>
+      </w:r>
+    </w:p>
+    <w:p>
+      <w:pPr>
+        <w:rPr>
+          <w:rFonts w:ascii="Times New Roman" w:hAnsi="Times New Roman" w:cs="Times New Roman"/>
+          <w:b/>
+          <w:bCs/>
+        </w:rPr>
+      </w:pPr>
+      <w:r>
+        <w:rPr>
+          <w:rFonts w:ascii="Times New Roman" w:hAnsi="Times New Roman" w:cs="Times New Roman"/>
+          <w:b/>
+          <w:bCs/>
+        </w:rPr>
+        <w:t xml:space="preserve">| </w:t>
+      </w:r>
+      <w:r>
+        <w:rPr>
+          <w:rFonts w:ascii="Segoe UI Emoji" w:hAnsi="Segoe UI Emoji" w:cs="Segoe UI Emoji"/>
+          <w:b/>
+          <w:bCs/>
+        </w:rPr>
+        <w:t>📄</w:t>
+      </w:r>
+      <w:r>
+        <w:rPr>
+          <w:rFonts w:ascii="Times New Roman" w:hAnsi="Times New Roman" w:cs="Times New Roman"/>
+          <w:b/>
+          <w:bCs/>
+        </w:rPr>
+        <w:t xml:space="preserve"> Reports              </w:t>
+      </w:r>
+    </w:p>
+    <w:p>
+      <w:pPr>
+        <w:rPr>
+          <w:rFonts w:ascii="Times New Roman" w:hAnsi="Times New Roman" w:cs="Times New Roman"/>
+          <w:b/>
+          <w:bCs/>
+        </w:rPr>
+      </w:pPr>
+      <w:r>
+        <w:rPr>
+          <w:rFonts w:ascii="Times New Roman" w:hAnsi="Times New Roman" w:cs="Times New Roman"/>
+          <w:b/>
+          <w:bCs/>
+        </w:rPr>
+        <w:t xml:space="preserve">| </w:t>
+      </w:r>
+      <w:r>
+        <w:rPr>
+          <w:rFonts w:ascii="Segoe UI Emoji" w:hAnsi="Segoe UI Emoji" w:cs="Segoe UI Emoji"/>
+          <w:b/>
+          <w:bCs/>
+        </w:rPr>
+        <w:t>👤</w:t>
+      </w:r>
+      <w:r>
+        <w:rPr>
+          <w:rFonts w:ascii="Times New Roman" w:hAnsi="Times New Roman" w:cs="Times New Roman"/>
+          <w:b/>
+          <w:bCs/>
+        </w:rPr>
+        <w:t xml:space="preserve"> Profile              </w:t>
+      </w:r>
+    </w:p>
+    <w:p>
+      <w:pPr>
+        <w:rPr>
+          <w:rFonts w:ascii="Times New Roman" w:hAnsi="Times New Roman" w:cs="Times New Roman"/>
+          <w:b/>
+          <w:bCs/>
+        </w:rPr>
+      </w:pPr>
+      <w:r>
+        <w:rPr>
+          <w:rFonts w:ascii="Times New Roman" w:hAnsi="Times New Roman" w:cs="Times New Roman"/>
+          <w:b/>
+          <w:bCs/>
+        </w:rPr>
+        <w:t xml:space="preserve">| </w:t>
+      </w:r>
+      <w:r>
+        <w:rPr>
+          <w:rFonts w:ascii="Segoe UI Emoji" w:hAnsi="Segoe UI Emoji" w:cs="Segoe UI Emoji"/>
+          <w:b/>
+          <w:bCs/>
+        </w:rPr>
+        <w:t>🚪</w:t>
+      </w:r>
+      <w:r>
+        <w:rPr>
+          <w:rFonts w:ascii="Times New Roman" w:hAnsi="Times New Roman" w:cs="Times New Roman"/>
+          <w:b/>
+          <w:bCs/>
+        </w:rPr>
+        <w:t xml:space="preserve"> Logout               </w:t>
+      </w:r>
+    </w:p>
+    <w:p>
+      <w:pPr>
+        <w:rPr>
+          <w:rFonts w:ascii="Times New Roman" w:hAnsi="Times New Roman" w:cs="Times New Roman"/>
+          <w:b/>
+          <w:bCs/>
+        </w:rPr>
+      </w:pPr>
+      <w:r>
+        <w:rPr>
+          <w:rFonts w:ascii="Times New Roman" w:hAnsi="Times New Roman" w:cs="Times New Roman"/>
+          <w:b/>
+          <w:bCs/>
+        </w:rPr>
+        <w:lastRenderedPageBreak/>
+        <w:t>----------------------------</w:t>
+      </w:r>
     </w:p>
     <w:p>
       <w:pPr>
@@ -10989,6 +11385,7 @@
   <w:style w:type="character" w:default="1" w:styleId="DefaultParagraphFont">
     <w:name w:val="Default Paragraph Font"/>
     <w:uiPriority w:val="1"/>
+    <w:semiHidden/>
     <w:unhideWhenUsed/>
   </w:style>
   <w:style w:type="table" w:default="1" w:styleId="TableNormal">

</xml_diff>